<commit_message>
Add Privacy Policy v1.0 (/privacy-policy) and updated membership application form
- New /privacy-policy page: 18-section policy, "at a glance" cards, sticky
  table of contents, print styles (content from src/data/privacy.ts)
- Policy names Google Maps on the Contact page and GIL's reliance on
  third-party services and their conduct (sections 3, 7 and 9)
- Privacy notices on the contact form and Membership page
- Membership application form with the data protection consent (section J)
- Sitemap entry; CONTENT-NEEDED item 44 done, open items P6, P8, P10

Co-Authored-By: Claude Opus 5.5 <noreply@anthropic.com>
</commit_message>
<xml_diff>
--- a/public/docs/gil-membership-application-form.docx
+++ b/public/docs/gil-membership-application-form.docx
@@ -4658,7 +4658,77 @@
           <w:sz w:val="17"/>
           <w:szCs w:val="17"/>
         </w:rPr>
-        <w:t xml:space="preserve">I consent to the Institute holding and using my personal information for membership administration, and to my name, category and district appearing in the published membership register.</w:t>
+        <w:t xml:space="preserve">I agree that the Institute may hold and use my personal information to assess this application and keep my membership and CPD records; may check my qualifications and registrations with the institutions and bodies I have named; and, if I ask the Institute to support my categorisation, candidacy or licensing, may share my name, qualifications, experience and recommended category with the Land Surveyors’ Board.</w:t>
+      </w:r>
+    </w:p>
+    <w:p>
+      <w:pPr>
+        <w:spacing w:after="80" w:before="0" w:line="252"/>
+      </w:pPr>
+      <w:r>
+        <w:rPr>
+          <w:rFonts w:ascii="Arial" w:cs="Arial" w:eastAsia="Arial" w:hAnsi="Arial"/>
+          <w:b/>
+          <w:bCs/>
+          <w:color w:val="14325E"/>
+          <w:sz w:val="17"/>
+          <w:szCs w:val="17"/>
+        </w:rPr>
+        <w:t xml:space="preserve">5.  </w:t>
+      </w:r>
+      <w:r>
+        <w:rPr>
+          <w:rFonts w:ascii="Arial" w:cs="Arial" w:eastAsia="Arial" w:hAnsi="Arial"/>
+          <w:color w:val="222222"/>
+          <w:sz w:val="17"/>
+          <w:szCs w:val="17"/>
+        </w:rPr>
+        <w:t xml:space="preserve">I understand that my information may be stored with the Institute’s email and document providers outside Lesotho; that my national ID or passport number, date of birth and certificates will never be published; and that I may ask to see or correct my information at any time, as set out in the GIL Privacy Policy on the Institute’s website.</w:t>
+      </w:r>
+    </w:p>
+    <w:p>
+      <w:pPr>
+        <w:spacing w:after="40" w:before="0" w:line="252"/>
+        <w:ind w:left="284"/>
+      </w:pPr>
+      <w:r>
+        <w:rPr>
+          <w:rFonts w:ascii="Arial" w:cs="Arial" w:eastAsia="Arial" w:hAnsi="Arial"/>
+          <w:color w:val="222222"/>
+          <w:sz w:val="17"/>
+          <w:szCs w:val="17"/>
+        </w:rPr>
+        <w:t xml:space="preserve">☐  I agree to items 4 and 5 (required)</w:t>
+      </w:r>
+    </w:p>
+    <w:p>
+      <w:pPr>
+        <w:spacing w:after="40" w:before="0" w:line="252"/>
+        <w:ind w:left="284"/>
+      </w:pPr>
+      <w:r>
+        <w:rPr>
+          <w:rFonts w:ascii="Arial" w:cs="Arial" w:eastAsia="Arial" w:hAnsi="Arial"/>
+          <w:color w:val="222222"/>
+          <w:sz w:val="17"/>
+          <w:szCs w:val="17"/>
+        </w:rPr>
+        <w:t xml:space="preserve">☐  If a public register of members is approved, I agree to my business contact details being shown in it (optional)</w:t>
+      </w:r>
+    </w:p>
+    <w:p>
+      <w:pPr>
+        <w:spacing w:after="120" w:before="0" w:line="252"/>
+        <w:ind w:left="284"/>
+      </w:pPr>
+      <w:r>
+        <w:rPr>
+          <w:rFonts w:ascii="Arial" w:cs="Arial" w:eastAsia="Arial" w:hAnsi="Arial"/>
+          <w:color w:val="222222"/>
+          <w:sz w:val="17"/>
+          <w:szCs w:val="17"/>
+        </w:rPr>
+        <w:t xml:space="preserve">☐  I would like to receive GIL news and event invitations (optional)</w:t>
       </w:r>
     </w:p>
     <w:tbl>

</xml_diff>